<commit_message>
Publish approved tourism CV and correct article subsection navigation
</commit_message>
<xml_diff>
--- a/documents/Ahmed-Mahmoud-CV.docx
+++ b/documents/Ahmed-Mahmoud-CV.docx
@@ -7,7 +7,130 @@
         <w:pStyle w:val="Title"/>
       </w:pPr>
       <w:r>
+        <w:rPr>
+          <w:rFonts w:ascii="Georgia" w:hAnsi="Georgia"/>
+        </w:rPr>
         <w:t>Ahmed Mahmoud</w:t>
+      </w:r>
+    </w:p>
+    <w:p>
+      <w:r>
+        <w:rPr>
+          <w:b/>
+        </w:rPr>
+        <w:t>Travel and Tourism Operations</w:t>
+      </w:r>
+    </w:p>
+    <w:p>
+      <w:pPr>
+        <w:spacing w:after="120"/>
+      </w:pPr>
+      <w:r>
+        <w:rPr/>
+        <w:t>Destination services · Tourism product support · MICE and event coordination</w:t>
+      </w:r>
+    </w:p>
+    <w:p>
+      <w:pPr>
+        <w:spacing w:after="40"/>
+      </w:pPr>
+      <w:r>
+        <w:rPr/>
+        <w:t>Den Haag, Netherlands · +31 6 2889 5967</w:t>
+      </w:r>
+    </w:p>
+    <w:p>
+      <w:pPr>
+        <w:spacing w:after="40"/>
+      </w:pPr>
+      <w:r>
+        <w:rPr/>
+      </w:r>
+      <w:hyperlink r:id="rId9">
+        <w:r>
+          <w:rPr>
+            <w:color w:val="253D48"/>
+            <w:u w:val="single"/>
+          </w:rPr>
+          <w:t>ahmed.mahmoud.nl.work@gmail.com</w:t>
+        </w:r>
+      </w:hyperlink>
+      <w:r>
+        <w:t xml:space="preserve"> · </w:t>
+      </w:r>
+      <w:hyperlink r:id="rId10">
+        <w:r>
+          <w:rPr>
+            <w:color w:val="253D48"/>
+            <w:u w:val="single"/>
+          </w:rPr>
+          <w:t>ahmedqualityops.com</w:t>
+        </w:r>
+      </w:hyperlink>
+    </w:p>
+    <w:p>
+      <w:pPr>
+        <w:spacing w:after="40"/>
+      </w:pPr>
+      <w:r>
+        <w:rPr/>
+      </w:r>
+      <w:hyperlink r:id="rId11">
+        <w:r>
+          <w:rPr>
+            <w:color w:val="253D48"/>
+            <w:u w:val="single"/>
+          </w:rPr>
+          <w:t>linkedin.com/in/ahmed-mahmoud-tourism</w:t>
+        </w:r>
+      </w:hyperlink>
+    </w:p>
+    <w:p>
+      <w:pPr>
+        <w:spacing w:after="160"/>
+      </w:pPr>
+      <w:r>
+        <w:rPr/>
+        <w:t>Authorised to work in the Netherlands without employer sponsorship.</w:t>
+      </w:r>
+    </w:p>
+    <w:p>
+      <w:pPr>
+        <w:pStyle w:val="Heading1"/>
+      </w:pPr>
+      <w:r>
+        <w:rPr/>
+        <w:t>Professional profile</w:t>
+      </w:r>
+    </w:p>
+    <w:p>
+      <w:r>
+        <w:rPr/>
+        <w:t>Travel and tourism professional with experience across Egypt and the UAE in destination services, B2B reservations, travel arrangements and cross-functional operations support. Coordinated guests, suppliers, transport and operational handovers. Based in Den Haag and seeking a role in tourism operations, tourism product support or MICE and event coordination.</w:t>
+      </w:r>
+    </w:p>
+    <w:p>
+      <w:pPr>
+        <w:pStyle w:val="Heading1"/>
+      </w:pPr>
+      <w:r>
+        <w:rPr/>
+        <w:t>Relevant capabilities</w:t>
+      </w:r>
+    </w:p>
+    <w:p>
+      <w:r>
+        <w:rPr/>
+        <w:t>Guest movements and transfers · Supplier coordination · Itineraries and quotations · B2B reservations · MICE and group logistics · Service recovery · Procedures and handovers · Process improvement</w:t>
+      </w:r>
+    </w:p>
+    <w:p>
+      <w:pPr>
+        <w:pStyle w:val="Heading1"/>
+      </w:pPr>
+      <w:r>
+        <w:rPr/>
+        <w:t>Professional experience</w:t>
       </w:r>
     </w:p>
     <w:p>
@@ -15,112 +138,59 @@
         <w:pStyle w:val="Heading2"/>
       </w:pPr>
       <w:r>
-        <w:t>Travel and Tourism Operations</w:t>
-      </w:r>
-    </w:p>
-    <w:p>
-      <w:r>
-        <w:t>DMC &amp; MICE | B2B Reservations | Service Quality &amp; Process Improvement</w:t>
-      </w:r>
-    </w:p>
-    <w:p>
-      <w:r>
-        <w:t>Netherlands | +31 6 2889 5967 | ahmed.mahmoud.nl.work@gmail.com</w:t>
-      </w:r>
-    </w:p>
-    <w:p>
-      <w:r>
-        <w:t>Authorised to work in the Netherlands. No employer sponsorship required.</w:t>
-      </w:r>
-    </w:p>
-    <w:p>
-      <w:r>
-        <w:t>ahmedqualityops.com | github.com/AhmedElshemyOps | linkedin.com/in/ahmed-mahmoud-tourism/</w:t>
+        <w:rPr/>
+        <w:t>Masarra DMC / Miral Experiences | Abu Dhabi, UAE</w:t>
       </w:r>
     </w:p>
     <w:p>
       <w:pPr>
-        <w:pStyle w:val="Heading1"/>
+        <w:keepNext/>
       </w:pPr>
       <w:r>
-        <w:t>Professional Profile</w:t>
-      </w:r>
-    </w:p>
-    <w:p>
-      <w:r>
-        <w:t>13 years in Travel &amp; Tourism and Hospitality across Egypt and the UAE, now based in the Netherlands. Experience in destination and DMC operations, B2B reservations, guest and supplier coordination, transport planning and process improvement.</w:t>
-      </w:r>
-    </w:p>
-    <w:p>
-      <w:r>
-        <w:t>Target roles: DMC and destination operations, B2B reservations, guest services and operational improvement in Travel &amp; Tourism and Hospitality.</w:t>
+        <w:rPr>
+          <w:color w:val="444444"/>
+          <w:sz w:val="19"/>
+        </w:rPr>
+        <w:t>Operations Department and cross-functional support | Dec 2024 - Oct 2026</w:t>
       </w:r>
     </w:p>
     <w:p>
       <w:pPr>
-        <w:pStyle w:val="Heading1"/>
+        <w:pStyle w:val="ListBullet"/>
+        <w:numPr>
+          <w:ilvl w:val="0"/>
+          <w:numId w:val="42"/>
+        </w:numPr>
       </w:pPr>
       <w:r>
-        <w:t>Selected Operational Scale</w:t>
-      </w:r>
-    </w:p>
-    <w:p>
-      <w:r>
-        <w:t>Approx. 350 guests per month and groups up to 45 at Masarra DMC; approx. 120 B2B booking and case transactions per day at WebBeds; approx. 15 vehicles and drivers coordinated at Alnatalie. These figures describe operating scope, not revenue or efficiency gains.</w:t>
+        <w:rPr/>
+        <w:t>Supported guest communication, transport, ticketing, suppliers and service recovery as part of the operations team.</w:t>
       </w:r>
     </w:p>
     <w:p>
       <w:pPr>
-        <w:pStyle w:val="Heading1"/>
+        <w:pStyle w:val="ListBullet"/>
+        <w:numPr>
+          <w:ilvl w:val="0"/>
+          <w:numId w:val="42"/>
+        </w:numPr>
       </w:pPr>
       <w:r>
-        <w:t>Professional Qualifications</w:t>
-      </w:r>
-    </w:p>
-    <w:p>
-      <w:r>
-        <w:t>Certified Associate in Project Management (CAPM) | Project Management Institute | 26 April 2024 - 26 April 2027</w:t>
-      </w:r>
-    </w:p>
-    <w:p>
-      <w:r>
-        <w:t>Lean Six Sigma Black Belt training certificate | Anexas Europe / Miral LLC | July 2025</w:t>
-      </w:r>
-    </w:p>
-    <w:p>
-      <w:r>
-        <w:t>ITIL V4 Foundation | PeopleCert / AXELOS | 1 August 2024 - 1 August 2027</w:t>
-      </w:r>
-    </w:p>
-    <w:p>
-      <w:r>
-        <w:t>Professional Certified Marketer (PCM) | American Marketing Association | July 2025 - July 2028 | Master CV record</w:t>
-      </w:r>
-    </w:p>
-    <w:p>
-      <w:r>
-        <w:t>CompTIA IT Fundamentals (ITF+) | CompTIA | June 2024 | Master CV record</w:t>
+        <w:rPr/>
+        <w:t>Contributed to MICE, familiarisation trips and industry events through airport and hotel representation, guest movements and stakeholder updates.</w:t>
       </w:r>
     </w:p>
     <w:p>
       <w:pPr>
-        <w:pStyle w:val="Heading1"/>
+        <w:pStyle w:val="ListBullet"/>
+        <w:numPr>
+          <w:ilvl w:val="0"/>
+          <w:numId w:val="42"/>
+        </w:numPr>
       </w:pPr>
       <w:r>
-        <w:t>IATA Diplomas</w:t>
-      </w:r>
-    </w:p>
-    <w:p>
-      <w:r>
-        <w:t>Travel Operations (March 2026) • MICE and Sales (July 2025) • Special Cargo Handling (January 2025) • Tour Production (September 2024) • Travel and Tourism Consultant (May 2021)</w:t>
-      </w:r>
-    </w:p>
-    <w:p>
-      <w:pPr>
-        <w:pStyle w:val="Heading1"/>
-      </w:pPr>
-      <w:r>
-        <w:t>Career Experience</w:t>
+        <w:rPr/>
+        <w:t>Contributed to airport-representative procedures, colleague coaching, Arabic CMS localisation and a Travel Desk improvement project.</w:t>
       </w:r>
     </w:p>
     <w:p>
@@ -128,20 +198,46 @@
         <w:pStyle w:val="Heading2"/>
       </w:pPr>
       <w:r>
-        <w:t>Masarra DMC - Miral Experiences | Abu Dhabi, UAE</w:t>
+        <w:rPr/>
+        <w:t>Oceanair Travels | Dubai, UAE</w:t>
       </w:r>
     </w:p>
     <w:p>
+      <w:pPr>
+        <w:keepNext/>
+      </w:pPr>
       <w:r>
         <w:rPr>
-          <w:b/>
+          <w:color w:val="444444"/>
+          <w:sz w:val="19"/>
         </w:rPr>
-        <w:t>Operations Department | From December 2024</w:t>
+        <w:t>Destination operations and guest coordination | Sep 2022 - Nov 2024</w:t>
       </w:r>
     </w:p>
     <w:p>
+      <w:pPr>
+        <w:pStyle w:val="ListBullet"/>
+        <w:numPr>
+          <w:ilvl w:val="0"/>
+          <w:numId w:val="42"/>
+        </w:numPr>
+      </w:pPr>
       <w:r>
-        <w:t>Supported approximately 350 guests per month and groups up to 45 through destination services, transport, ticketing, supplier coordination and service recovery. Contributed to MICE, FAM and industry-event operations, including airport and hotel representation, guest movements, venues and live stakeholder communication. Developed airport-representative procedures and operational handovers; supported Strapi Arabic localisation, BOS and Otolo Homes workflows, colleague coaching and a Travel Desk DMAIC project.</w:t>
+        <w:rPr/>
+        <w:t>Coordinated destination programmes, hotel pickups, transport, tickets, attraction timing and supplier handovers.</w:t>
+      </w:r>
+    </w:p>
+    <w:p>
+      <w:pPr>
+        <w:pStyle w:val="ListBullet"/>
+        <w:numPr>
+          <w:ilvl w:val="0"/>
+          <w:numId w:val="42"/>
+        </w:numPr>
+      </w:pPr>
+      <w:r>
+        <w:rPr/>
+        <w:t>Handled guest communication and service recovery during delays and programme changes.</w:t>
       </w:r>
     </w:p>
     <w:p>
@@ -149,20 +245,46 @@
         <w:pStyle w:val="Heading2"/>
       </w:pPr>
       <w:r>
-        <w:t>Oceanair Travels | Dubai, UAE</w:t>
+        <w:rPr/>
+        <w:t>WebBeds Middle East and Africa | Cairo, Egypt</w:t>
       </w:r>
     </w:p>
     <w:p>
+      <w:pPr>
+        <w:keepNext/>
+      </w:pPr>
       <w:r>
         <w:rPr>
-          <w:b/>
+          <w:color w:val="444444"/>
+          <w:sz w:val="19"/>
         </w:rPr>
-        <w:t>Operations Department | September 2022 - November 2024</w:t>
+        <w:t>B2B reservations and partner support | Jun 2022 - Sep 2022</w:t>
       </w:r>
     </w:p>
     <w:p>
+      <w:pPr>
+        <w:pStyle w:val="ListBullet"/>
+        <w:numPr>
+          <w:ilvl w:val="0"/>
+          <w:numId w:val="42"/>
+        </w:numPr>
+      </w:pPr>
       <w:r>
-        <w:t>Coordinated destination programmes for international groups up to 35, including hotel pickups, transport, tickets, attractions, timing and supplier interfaces. Protected itinerary continuity during delays and live changes through multilingual guest communication and service recovery.</w:t>
+        <w:rPr/>
+        <w:t>Handled booking cases using Juniper and Freshdesk, including amendments, discrepancies, refunds and relocations.</w:t>
+      </w:r>
+    </w:p>
+    <w:p>
+      <w:pPr>
+        <w:pStyle w:val="ListBullet"/>
+        <w:numPr>
+          <w:ilvl w:val="0"/>
+          <w:numId w:val="42"/>
+        </w:numPr>
+      </w:pPr>
+      <w:r>
+        <w:rPr/>
+        <w:t>Supported French-speaking hotel markets in Tunisia, Morocco and Algeria, working with partners and internal teams.</w:t>
       </w:r>
     </w:p>
     <w:p>
@@ -170,20 +292,33 @@
         <w:pStyle w:val="Heading2"/>
       </w:pPr>
       <w:r>
-        <w:t>WebBeds Middle East &amp; Africa | Cairo, Egypt</w:t>
+        <w:rPr/>
+        <w:t>Fun and Sun / TUI CIS | Sharm El Sheikh, Egypt</w:t>
       </w:r>
     </w:p>
     <w:p>
+      <w:pPr>
+        <w:keepNext/>
+      </w:pPr>
       <w:r>
         <w:rPr>
-          <w:b/>
+          <w:color w:val="444444"/>
+          <w:sz w:val="19"/>
         </w:rPr>
-        <w:t>Reservations and B2B Operations | June 2022 - September 2022</w:t>
+        <w:t>Excursions, airport transfers and guest services | Jul 2021 - Apr 2022</w:t>
       </w:r>
     </w:p>
     <w:p>
+      <w:pPr>
+        <w:pStyle w:val="ListBullet"/>
+        <w:numPr>
+          <w:ilvl w:val="0"/>
+          <w:numId w:val="42"/>
+        </w:numPr>
+      </w:pPr>
       <w:r>
-        <w:t>Handled approximately 120 B2B booking and case transactions per day using Juniper and Freshdesk. Supported French-speaking hotel markets in Tunisia, Morocco and Algeria; resolved booking discrepancies, amendments, rates, refunds and relocations through partner and internal-team coordination.</w:t>
+        <w:rPr/>
+        <w:t>Coordinated excursions, arrivals, departures and transfers; supported guest issues and programme changes, including CIS and Russian-speaking markets.</w:t>
       </w:r>
     </w:p>
     <w:p>
@@ -196,7 +331,8 @@
         <w:pStyle w:val="Heading1"/>
       </w:pPr>
       <w:r>
-        <w:t>Ahmed Mahmoud | Career Experience continued</w:t>
+        <w:rPr/>
+        <w:t>Earlier professional experience</w:t>
       </w:r>
     </w:p>
     <w:p>
@@ -204,20 +340,46 @@
         <w:pStyle w:val="Heading2"/>
       </w:pPr>
       <w:r>
-        <w:t>Fun &amp; Sun / TUI CIS | Sharm El Sheikh, Egypt</w:t>
+        <w:rPr/>
+        <w:t>Alnatalie Red Sea Tours | Cairo, Egypt</w:t>
       </w:r>
     </w:p>
     <w:p>
+      <w:pPr>
+        <w:keepNext/>
+      </w:pPr>
       <w:r>
         <w:rPr>
-          <w:b/>
+          <w:color w:val="444444"/>
+          <w:sz w:val="19"/>
         </w:rPr>
-        <w:t>Operations Department | July 2021 - April 2022</w:t>
+        <w:t>Transport and fleet coordination | Jan 2020 - Jun 2021</w:t>
       </w:r>
     </w:p>
     <w:p>
+      <w:pPr>
+        <w:pStyle w:val="ListBullet"/>
+        <w:numPr>
+          <w:ilvl w:val="0"/>
+          <w:numId w:val="42"/>
+        </w:numPr>
+      </w:pPr>
       <w:r>
-        <w:t>Coordinated daily destination programmes, excursions, airport arrivals, departures and transfers for multinational groups up to 19. Handled guest issues and programme changes while maintaining timing, safety and service standards, including support for CIS and Russian-speaking markets.</w:t>
+        <w:rPr/>
+        <w:t>Coordinated vehicle and driver allocation, GPS follow-up, maintenance scheduling and operational readiness.</w:t>
+      </w:r>
+    </w:p>
+    <w:p>
+      <w:pPr>
+        <w:pStyle w:val="ListBullet"/>
+        <w:numPr>
+          <w:ilvl w:val="0"/>
+          <w:numId w:val="42"/>
+        </w:numPr>
+      </w:pPr>
+      <w:r>
+        <w:rPr/>
+        <w:t>Supported transport for the 2021 IHF Men's World Championship, including airport, hotel and competition-venue movements.</w:t>
       </w:r>
     </w:p>
     <w:p>
@@ -225,41 +387,46 @@
         <w:pStyle w:val="Heading2"/>
       </w:pPr>
       <w:r>
-        <w:t>Alnatalie Red Sea Tours | Cairo, Egypt</w:t>
-      </w:r>
-    </w:p>
-    <w:p>
-      <w:r>
-        <w:rPr>
-          <w:b/>
-        </w:rPr>
-        <w:t>Operations Department | January 2020 - June 2021</w:t>
-      </w:r>
-    </w:p>
-    <w:p>
-      <w:r>
-        <w:t>Coordinated approximately 15 vehicles and drivers, daily allocation, GPS follow-up, maintenance schedules, insurance administration and operational readiness. Supported transport operations connected to the 2021 IHF Men's World Championship, including movements between airports, hotels and competition venues.</w:t>
+        <w:rPr/>
+        <w:t>Elmadina Tours | Cairo, Egypt</w:t>
       </w:r>
     </w:p>
     <w:p>
       <w:pPr>
-        <w:pStyle w:val="Heading2"/>
+        <w:keepNext/>
       </w:pPr>
       <w:r>
-        <w:t>Elmadina Tours | Cairo, Egypt</w:t>
+        <w:rPr>
+          <w:color w:val="444444"/>
+          <w:sz w:val="19"/>
+        </w:rPr>
+        <w:t>Travel consulting and package arrangements | Jan 2013 - Jan 2020</w:t>
       </w:r>
     </w:p>
     <w:p>
+      <w:pPr>
+        <w:pStyle w:val="ListBullet"/>
+        <w:numPr>
+          <w:ilvl w:val="0"/>
+          <w:numId w:val="42"/>
+        </w:numPr>
+      </w:pPr>
       <w:r>
-        <w:rPr>
-          <w:b/>
-        </w:rPr>
-        <w:t>Travel and Tourism Consultant | January 2013 - January 2020</w:t>
+        <w:rPr/>
+        <w:t>Designed, quoted and sold leisure and honeymoon packages; coordinated itineraries, accommodation, suppliers and customer follow-up.</w:t>
       </w:r>
     </w:p>
     <w:p>
+      <w:pPr>
+        <w:pStyle w:val="ListBullet"/>
+        <w:numPr>
+          <w:ilvl w:val="0"/>
+          <w:numId w:val="42"/>
+        </w:numPr>
+      </w:pPr>
       <w:r>
-        <w:t>Designed, quoted and sold leisure, honeymoon and couple packages; coordinated itineraries, hotels, suppliers and customer follow-up. Managed Hajj and Umrah arrangements, flights, visas and documentation, accommodation in Makkah and Madinah, and programme coordination using SAFA and Amadeus workflows.</w:t>
+        <w:rPr/>
+        <w:t>Coordinated Hajj and Umrah arrangements, flights, visas and accommodation using SAFA and Amadeus workflows.</w:t>
       </w:r>
     </w:p>
     <w:p>
@@ -267,46 +434,68 @@
         <w:pStyle w:val="Heading1"/>
       </w:pPr>
       <w:r>
-        <w:t>Selected Cases and Recent Contributions</w:t>
-      </w:r>
-    </w:p>
-    <w:p>
-      <w:pPr>
-        <w:pStyle w:val="Heading2"/>
-      </w:pPr>
-      <w:r>
-        <w:t>Travel Desk DMAIC improvement</w:t>
+        <w:rPr/>
+        <w:t>Selected projects</w:t>
       </w:r>
     </w:p>
     <w:p>
       <w:r>
-        <w:t>Lean Six Sigma workplace project on agent allocation, training, multilingual materials and control planning. Baseline median monthly agent sales: AED 8,059; target: AED 12,500. The AED 746,088 annual opportunity across 14 agents is projected and conditional on target achievement; it is not realised revenue.</w:t>
+        <w:rPr/>
       </w:r>
-    </w:p>
-    <w:p>
-      <w:pPr>
-        <w:pStyle w:val="Heading2"/>
-      </w:pPr>
       <w:r>
-        <w:t>Amsterdam tourism product discovery and Netherlands relevance</w:t>
+        <w:rPr>
+          <w:b/>
+        </w:rPr>
+        <w:t>Travel Desk improvement</w:t>
+      </w:r>
+      <w:r>
+        <w:t xml:space="preserve"> | Workplace project</w:t>
       </w:r>
     </w:p>
     <w:p>
       <w:r>
-        <w:t>12-part Amsterdam research case connecting customer evidence, requirements, supplier feasibility, unit economics and pilot controls. Demonstrates how international destination experience can inform Dutch product discovery. Pre-pilot research with an iterate decision; departures and post-pilot outcomes are not established.</w:t>
-      </w:r>
-    </w:p>
-    <w:p>
-      <w:pPr>
-        <w:pStyle w:val="Heading2"/>
-      </w:pPr>
-      <w:r>
-        <w:t>Four operational workflow demonstrations</w:t>
+        <w:rPr/>
+        <w:t>Applied DMAIC to agent allocation, training, multilingual materials and control planning. The financial opportunity was a conditional projection, not realised revenue.</w:t>
       </w:r>
     </w:p>
     <w:p>
       <w:r>
-        <w:t>InfraQuote supports quotation and margin checks. InfraDispatch explores assignments, route constraints and field handovers for the Netherlands and UAE. InfraSky supports viewing-readiness decisions for Dutch and UAE locations. InfraCluster groups pickups and reviews capacity. Four static browser MVPs with sample or operator-entered data; live integrations and measured production outcomes are not established. Case studies and demos: ahmedqualityops.com/projects/.</w:t>
+        <w:rPr/>
+      </w:r>
+      <w:r>
+        <w:rPr>
+          <w:b/>
+        </w:rPr>
+        <w:t>Amsterdam tourism product discovery</w:t>
+      </w:r>
+      <w:r>
+        <w:t xml:space="preserve"> | Portfolio research, pre-pilot</w:t>
+      </w:r>
+    </w:p>
+    <w:p>
+      <w:r>
+        <w:rPr/>
+        <w:t>Developed research and planning materials covering customer evidence, product requirements, supplier feasibility, unit economics and pilot controls. No commercial departures or measured post-pilot outcomes are claimed.</w:t>
+      </w:r>
+    </w:p>
+    <w:p>
+      <w:r>
+        <w:rPr/>
+      </w:r>
+      <w:r>
+        <w:rPr>
+          <w:b/>
+        </w:rPr>
+        <w:t>InfraQuote and InfraDispatch</w:t>
+      </w:r>
+      <w:r>
+        <w:t xml:space="preserve"> | Browser demonstrations</w:t>
+      </w:r>
+    </w:p>
+    <w:p>
+      <w:r>
+        <w:rPr/>
+        <w:t>Built portfolio demonstrations of quotation review, movement planning and operational handovers using sample or operator-entered data. These are prototypes, not production client deployments.</w:t>
       </w:r>
     </w:p>
     <w:p>
@@ -314,12 +503,71 @@
         <w:pStyle w:val="Heading1"/>
       </w:pPr>
       <w:r>
-        <w:t>Education</w:t>
+        <w:rPr/>
+        <w:t>Selected qualifications</w:t>
       </w:r>
     </w:p>
     <w:p>
+      <w:pPr>
+        <w:spacing w:after="40" w:line="240" w:lineRule="auto"/>
+      </w:pPr>
       <w:r>
-        <w:t>Cairo University | Faculty of Law | Licence / Bachelor of Law | 2006–2010</w:t>
+        <w:rPr/>
+        <w:t>IATA Travel Operations diploma | Mar 2026</w:t>
+      </w:r>
+    </w:p>
+    <w:p>
+      <w:pPr>
+        <w:spacing w:after="40" w:line="240" w:lineRule="auto"/>
+      </w:pPr>
+      <w:r>
+        <w:rPr/>
+        <w:t>IATA MICE and Sales diploma | Jul 2025</w:t>
+      </w:r>
+    </w:p>
+    <w:p>
+      <w:pPr>
+        <w:spacing w:after="40" w:line="240" w:lineRule="auto"/>
+      </w:pPr>
+      <w:r>
+        <w:rPr/>
+        <w:t>IATA Tour Production diploma | Sep 2024</w:t>
+      </w:r>
+    </w:p>
+    <w:p>
+      <w:pPr>
+        <w:spacing w:after="40" w:line="240" w:lineRule="auto"/>
+      </w:pPr>
+      <w:r>
+        <w:rPr/>
+        <w:t>IATA Travel and Tourism Consultant diploma | May 2021</w:t>
+      </w:r>
+    </w:p>
+    <w:p>
+      <w:pPr>
+        <w:spacing w:after="40" w:line="240" w:lineRule="auto"/>
+      </w:pPr>
+      <w:r>
+        <w:rPr/>
+        <w:t>Certified Associate in Project Management (CAPM), PMI | Apr 2024 - Apr 2027</w:t>
+      </w:r>
+    </w:p>
+    <w:p>
+      <w:pPr>
+        <w:spacing w:after="40" w:line="240" w:lineRule="auto"/>
+      </w:pPr>
+      <w:r>
+        <w:rPr/>
+        <w:t>Lean Six Sigma Black Belt training certificate, Anexas Europe / Miral LLC | Jul 2025</w:t>
+      </w:r>
+    </w:p>
+    <w:p>
+      <w:pPr>
+        <w:spacing w:after="40" w:line="240" w:lineRule="auto"/>
+      </w:pPr>
+      <w:r>
+        <w:rPr/>
+        <w:t>ITIL V4 Foundation | Recorded certificate dates Aug 2024 - Aug 2027</w:t>
       </w:r>
     </w:p>
     <w:p>
@@ -327,12 +575,14 @@
         <w:pStyle w:val="Heading1"/>
       </w:pPr>
       <w:r>
-        <w:t>Languages</w:t>
+        <w:rPr/>
+        <w:t>Education</w:t>
       </w:r>
     </w:p>
     <w:p>
       <w:r>
-        <w:t>Arabic - native; French - B1+; DELF B1 and approximately 450 study hours; English - advanced professional; Russian - A2; approximately 250 study hours; Dutch - A1, actively studying.</w:t>
+        <w:rPr/>
+        <w:t>Licence / Bachelor of Law | Faculty of Law, Cairo University | 2006 - 2010</w:t>
       </w:r>
     </w:p>
     <w:p>
@@ -340,17 +590,14 @@
         <w:pStyle w:val="Heading1"/>
       </w:pPr>
       <w:r>
-        <w:t>Systems and Methods</w:t>
+        <w:rPr/>
+        <w:t>Languages</w:t>
       </w:r>
     </w:p>
     <w:p>
       <w:r>
-        <w:t>BOS System, Otolo Homes, Juniper, Freshdesk, Sriggle, SAFA, Amadeus, Strapi CMS, Excel and Microsoft Office, Google Workspace, GitHub, HTML and JavaScript.</w:t>
-      </w:r>
-    </w:p>
-    <w:p>
-      <w:r>
-        <w:t>DMAIC and root-cause analysis; SOPs, process mapping and RACI; Service recovery and KPI controls; Voice of Customer and requirements traceability; Supplier feasibility and unit economics; MVP and pilot planning.</w:t>
+        <w:rPr/>
+        <w:t>Arabic: native · English: advanced professional · French: B1+ (self-assessed), DELF B1 · Russian: A2 · Dutch: A1, actively studying</w:t>
       </w:r>
     </w:p>
     <w:p>
@@ -358,23 +605,20 @@
         <w:pStyle w:val="Heading1"/>
       </w:pPr>
       <w:r>
-        <w:t>Leadership, Safety and Further Training</w:t>
+        <w:rPr/>
+        <w:t>Systems</w:t>
       </w:r>
     </w:p>
     <w:p>
       <w:r>
-        <w:t>First Time Leading Others (February 2025); Highfield Level 2 COSHH, Merit (October 2025); AHA Heartsaver First Aid CPR AED (August 2025; renew by August 2027); IATA Pharma Products and Vaccines by Air (May 2024); risk assessment, work at height and safe handling; ETAA operations and sales courses (2019).</w:t>
-      </w:r>
-    </w:p>
-    <w:p>
-      <w:r>
-        <w:t>Five UAE destination authorisations; UAE manual driving licence; intermediate desert-driving training and RYA Powerboat Level 2. Further training includes food safety, maritime readiness, vehicle assessment and insurance fundamentals.</w:t>
+        <w:rPr/>
+        <w:t>Juniper · Freshdesk · Amadeus · SAFA · BOS · Otolo Homes · Strapi CMS · Excel and Microsoft Office · Google Workspace</w:t>
       </w:r>
     </w:p>
     <w:sectPr>
-      <w:footerReference w:type="default" r:id="rId9"/>
-      <w:pgSz w:w="11909" w:h="16834"/>
-      <w:pgMar w:top="720" w:right="936" w:bottom="720" w:left="936" w:header="720" w:footer="720" w:gutter="0"/>
+      <w:footerReference w:type="default" r:id="rId12"/>
+      <w:pgSz w:w="11906" w:h="16838"/>
+      <w:pgMar w:top="907" w:right="1077" w:bottom="907" w:left="1077" w:header="397" w:footer="454" w:gutter="0"/>
       <w:cols w:space="720"/>
       <w:docGrid w:linePitch="360"/>
     </w:sectPr>
@@ -391,9 +635,10 @@
     </w:pPr>
     <w:r>
       <w:rPr>
+        <w:color w:val="666666"/>
         <w:sz w:val="16"/>
       </w:rPr>
-      <w:t xml:space="preserve">Ahmed Mahmoud | Updated 8 October 2026 | </w:t>
+      <w:t xml:space="preserve">Ahmed Mahmoud  |  </w:t>
     </w:r>
     <w:fldSimple w:instr="PAGE"/>
   </w:p>
@@ -599,6 +844,20 @@
   </w:num>
   <w:num w:numId="9">
     <w:abstractNumId w:val="0"/>
+  </w:num>
+  <w:abstractNum w:abstractNumId="42">
+    <w:lvl w:ilvl="0">
+      <w:start w:val="1"/>
+      <w:numFmt w:val="bullet"/>
+      <w:lvlText w:val="•"/>
+      <w:lvlJc w:val="left"/>
+      <w:pPr>
+        <w:ind w:left="200" w:hanging="200"/>
+      </w:pPr>
+    </w:lvl>
+  </w:abstractNum>
+  <w:num w:numId="42">
+    <w:abstractNumId w:val="42"/>
   </w:num>
 </w:numbering>
 </file>
@@ -764,11 +1023,14 @@
     <w:qFormat/>
     <w:rsid w:val="00FC693F"/>
     <w:pPr>
-      <w:spacing w:after="80" w:line="245" w:lineRule="auto"/>
+      <w:widowControl/>
+      <w:spacing w:after="80" w:line="257" w:lineRule="auto"/>
     </w:pPr>
     <w:rPr>
-      <w:rFonts w:ascii="Calibri" w:hAnsi="Calibri"/>
-      <w:sz w:val="18"/>
+      <w:rFonts w:ascii="Arial" w:hAnsi="Arial"/>
+      <w:color w:val="000000"/>
+      <w:sz w:val="21"/>
+      <w:lang w:val="en-GB"/>
     </w:rPr>
   </w:style>
   <w:style w:type="paragraph" w:styleId="Header">
@@ -826,15 +1088,16 @@
     <w:pPr>
       <w:keepNext/>
       <w:keepLines/>
-      <w:spacing w:before="160" w:after="60"/>
+      <w:widowControl/>
+      <w:spacing w:before="200" w:after="80"/>
       <w:outlineLvl w:val="0"/>
     </w:pPr>
     <w:rPr>
-      <w:rFonts w:asciiTheme="majorHAnsi" w:eastAsiaTheme="majorEastAsia" w:hAnsiTheme="majorHAnsi" w:cstheme="majorBidi" w:ascii="Calibri" w:hAnsi="Calibri"/>
+      <w:rFonts w:ascii="Arial" w:hAnsi="Arial"/>
       <w:b/>
       <w:bCs/>
-      <w:color w:val="10283F"/>
-      <w:sz w:val="22"/>
+      <w:color w:val="000000"/>
+      <w:sz w:val="23"/>
       <w:szCs w:val="28"/>
     </w:rPr>
   </w:style>
@@ -850,15 +1113,16 @@
     <w:pPr>
       <w:keepNext/>
       <w:keepLines/>
-      <w:spacing w:before="160" w:after="60"/>
+      <w:widowControl/>
+      <w:spacing w:before="140" w:after="80"/>
       <w:outlineLvl w:val="1"/>
     </w:pPr>
     <w:rPr>
-      <w:rFonts w:asciiTheme="majorHAnsi" w:eastAsiaTheme="majorEastAsia" w:hAnsiTheme="majorHAnsi" w:cstheme="majorBidi" w:ascii="Calibri" w:hAnsi="Calibri"/>
+      <w:rFonts w:ascii="Arial" w:hAnsi="Arial"/>
       <w:b/>
       <w:bCs/>
-      <w:color w:val="10283F"/>
-      <w:sz w:val="20"/>
+      <w:color w:val="000000"/>
+      <w:sz w:val="21"/>
       <w:szCs w:val="26"/>
     </w:rPr>
   </w:style>
@@ -878,7 +1142,7 @@
       <w:outlineLvl w:val="2"/>
     </w:pPr>
     <w:rPr>
-      <w:rFonts w:asciiTheme="majorHAnsi" w:eastAsiaTheme="majorEastAsia" w:hAnsiTheme="majorHAnsi" w:cstheme="majorBidi"/>
+      <w:rFonts/>
       <w:b/>
       <w:bCs/>
       <w:color w:val="4F81BD" w:themeColor="accent1"/>
@@ -901,7 +1165,7 @@
       <w:outlineLvl w:val="3"/>
     </w:pPr>
     <w:rPr>
-      <w:rFonts w:asciiTheme="majorHAnsi" w:eastAsiaTheme="majorEastAsia" w:hAnsiTheme="majorHAnsi" w:cstheme="majorBidi"/>
+      <w:rFonts/>
       <w:b/>
       <w:bCs/>
       <w:i/>
@@ -926,7 +1190,7 @@
       <w:outlineLvl w:val="4"/>
     </w:pPr>
     <w:rPr>
-      <w:rFonts w:asciiTheme="majorHAnsi" w:eastAsiaTheme="majorEastAsia" w:hAnsiTheme="majorHAnsi" w:cstheme="majorBidi"/>
+      <w:rFonts/>
       <w:color w:val="243F60" w:themeColor="accent1" w:themeShade="7F"/>
     </w:rPr>
   </w:style>
@@ -947,7 +1211,7 @@
       <w:outlineLvl w:val="5"/>
     </w:pPr>
     <w:rPr>
-      <w:rFonts w:asciiTheme="majorHAnsi" w:eastAsiaTheme="majorEastAsia" w:hAnsiTheme="majorHAnsi" w:cstheme="majorBidi"/>
+      <w:rFonts/>
       <w:i/>
       <w:iCs/>
       <w:color w:val="243F60" w:themeColor="accent1" w:themeShade="7F"/>
@@ -970,7 +1234,7 @@
       <w:outlineLvl w:val="6"/>
     </w:pPr>
     <w:rPr>
-      <w:rFonts w:asciiTheme="majorHAnsi" w:eastAsiaTheme="majorEastAsia" w:hAnsiTheme="majorHAnsi" w:cstheme="majorBidi"/>
+      <w:rFonts/>
       <w:i/>
       <w:iCs/>
       <w:color w:val="404040" w:themeColor="text1" w:themeTint="BF"/>
@@ -993,7 +1257,7 @@
       <w:outlineLvl w:val="7"/>
     </w:pPr>
     <w:rPr>
-      <w:rFonts w:asciiTheme="majorHAnsi" w:eastAsiaTheme="majorEastAsia" w:hAnsiTheme="majorHAnsi" w:cstheme="majorBidi"/>
+      <w:rFonts/>
       <w:color w:val="4F81BD" w:themeColor="accent1"/>
       <w:sz w:val="20"/>
       <w:szCs w:val="20"/>
@@ -1016,7 +1280,7 @@
       <w:outlineLvl w:val="8"/>
     </w:pPr>
     <w:rPr>
-      <w:rFonts w:asciiTheme="majorHAnsi" w:eastAsiaTheme="majorEastAsia" w:hAnsiTheme="majorHAnsi" w:cstheme="majorBidi"/>
+      <w:rFonts/>
       <w:i/>
       <w:iCs/>
       <w:color w:val="404040" w:themeColor="text1" w:themeTint="BF"/>
@@ -1067,7 +1331,7 @@
     <w:uiPriority w:val="9"/>
     <w:rsid w:val="00FC693F"/>
     <w:rPr>
-      <w:rFonts w:asciiTheme="majorHAnsi" w:eastAsiaTheme="majorEastAsia" w:hAnsiTheme="majorHAnsi" w:cstheme="majorBidi"/>
+      <w:rFonts/>
       <w:b/>
       <w:bCs/>
       <w:color w:val="365F91" w:themeColor="accent1" w:themeShade="BF"/>
@@ -1082,7 +1346,7 @@
     <w:uiPriority w:val="9"/>
     <w:rsid w:val="00FC693F"/>
     <w:rPr>
-      <w:rFonts w:asciiTheme="majorHAnsi" w:eastAsiaTheme="majorEastAsia" w:hAnsiTheme="majorHAnsi" w:cstheme="majorBidi"/>
+      <w:rFonts/>
       <w:b/>
       <w:bCs/>
       <w:color w:val="4F81BD" w:themeColor="accent1"/>
@@ -1097,7 +1361,7 @@
     <w:uiPriority w:val="9"/>
     <w:rsid w:val="00FC693F"/>
     <w:rPr>
-      <w:rFonts w:asciiTheme="majorHAnsi" w:eastAsiaTheme="majorEastAsia" w:hAnsiTheme="majorHAnsi" w:cstheme="majorBidi"/>
+      <w:rFonts/>
       <w:b/>
       <w:bCs/>
       <w:color w:val="4F81BD" w:themeColor="accent1"/>
@@ -1112,15 +1376,16 @@
     <w:qFormat/>
     <w:rsid w:val="00FC693F"/>
     <w:pPr>
-      <w:spacing w:after="60" w:line="240" w:lineRule="auto"/>
+      <w:widowControl/>
+      <w:spacing w:after="80" w:line="240" w:lineRule="auto"/>
       <w:contextualSpacing/>
     </w:pPr>
     <w:rPr>
-      <w:rFonts w:asciiTheme="majorHAnsi" w:eastAsiaTheme="majorEastAsia" w:hAnsiTheme="majorHAnsi" w:cstheme="majorBidi" w:ascii="Calibri" w:hAnsi="Calibri"/>
+      <w:rFonts w:ascii="Georgia" w:hAnsi="Georgia"/>
       <w:color w:val="000000"/>
       <w:spacing w:val="5"/>
       <w:kern w:val="28"/>
-      <w:sz w:val="50"/>
+      <w:sz w:val="54"/>
       <w:szCs w:val="52"/>
     </w:rPr>
   </w:style>
@@ -1131,7 +1396,7 @@
     <w:uiPriority w:val="10"/>
     <w:rsid w:val="00FC693F"/>
     <w:rPr>
-      <w:rFonts w:asciiTheme="majorHAnsi" w:eastAsiaTheme="majorEastAsia" w:hAnsiTheme="majorHAnsi" w:cstheme="majorBidi"/>
+      <w:rFonts/>
       <w:color w:val="17365D" w:themeColor="text2" w:themeShade="BF"/>
       <w:spacing w:val="5"/>
       <w:kern w:val="28"/>
@@ -1148,15 +1413,16 @@
     <w:qFormat/>
     <w:rsid w:val="00FC693F"/>
     <w:pPr>
+      <w:widowControl/>
       <w:numPr>
         <w:ilvl w:val="1"/>
       </w:numPr>
     </w:pPr>
     <w:rPr>
-      <w:rFonts w:asciiTheme="majorHAnsi" w:eastAsiaTheme="majorEastAsia" w:hAnsiTheme="majorHAnsi" w:cstheme="majorBidi"/>
+      <w:rFonts w:ascii="Arial" w:hAnsi="Arial"/>
       <w:i/>
       <w:iCs/>
-      <w:color w:val="4F81BD" w:themeColor="accent1"/>
+      <w:color w:val="000000"/>
       <w:spacing w:val="15"/>
       <w:sz w:val="24"/>
       <w:szCs w:val="24"/>
@@ -1169,7 +1435,7 @@
     <w:uiPriority w:val="11"/>
     <w:rsid w:val="00FC693F"/>
     <w:rPr>
-      <w:rFonts w:asciiTheme="majorHAnsi" w:eastAsiaTheme="majorEastAsia" w:hAnsiTheme="majorHAnsi" w:cstheme="majorBidi"/>
+      <w:rFonts/>
       <w:i/>
       <w:iCs/>
       <w:color w:val="4F81BD" w:themeColor="accent1"/>
@@ -1291,11 +1557,19 @@
     <w:unhideWhenUsed/>
     <w:rsid w:val="00326F90"/>
     <w:pPr>
+      <w:widowControl/>
       <w:numPr>
         <w:numId w:val="1"/>
       </w:numPr>
+      <w:spacing w:after="60" w:line="252" w:lineRule="auto"/>
+      <w:ind w:left="198" w:hanging="198"/>
       <w:contextualSpacing/>
     </w:pPr>
+    <w:rPr>
+      <w:rFonts w:ascii="Arial" w:hAnsi="Arial"/>
+      <w:color w:val="000000"/>
+      <w:sz w:val="21"/>
+    </w:rPr>
   </w:style>
   <w:style w:type="paragraph" w:styleId="ListBullet2">
     <w:name w:val="List Bullet 2"/>
@@ -1467,7 +1741,7 @@
     <w:semiHidden/>
     <w:rsid w:val="00FC693F"/>
     <w:rPr>
-      <w:rFonts w:asciiTheme="majorHAnsi" w:eastAsiaTheme="majorEastAsia" w:hAnsiTheme="majorHAnsi" w:cstheme="majorBidi"/>
+      <w:rFonts/>
       <w:b/>
       <w:bCs/>
       <w:i/>
@@ -1483,7 +1757,7 @@
     <w:semiHidden/>
     <w:rsid w:val="00FC693F"/>
     <w:rPr>
-      <w:rFonts w:asciiTheme="majorHAnsi" w:eastAsiaTheme="majorEastAsia" w:hAnsiTheme="majorHAnsi" w:cstheme="majorBidi"/>
+      <w:rFonts/>
       <w:color w:val="243F60" w:themeColor="accent1" w:themeShade="7F"/>
     </w:rPr>
   </w:style>
@@ -1495,7 +1769,7 @@
     <w:semiHidden/>
     <w:rsid w:val="00FC693F"/>
     <w:rPr>
-      <w:rFonts w:asciiTheme="majorHAnsi" w:eastAsiaTheme="majorEastAsia" w:hAnsiTheme="majorHAnsi" w:cstheme="majorBidi"/>
+      <w:rFonts/>
       <w:i/>
       <w:iCs/>
       <w:color w:val="243F60" w:themeColor="accent1" w:themeShade="7F"/>
@@ -1509,7 +1783,7 @@
     <w:semiHidden/>
     <w:rsid w:val="00FC693F"/>
     <w:rPr>
-      <w:rFonts w:asciiTheme="majorHAnsi" w:eastAsiaTheme="majorEastAsia" w:hAnsiTheme="majorHAnsi" w:cstheme="majorBidi"/>
+      <w:rFonts/>
       <w:i/>
       <w:iCs/>
       <w:color w:val="404040" w:themeColor="text1" w:themeTint="BF"/>
@@ -1523,7 +1797,7 @@
     <w:semiHidden/>
     <w:rsid w:val="00FC693F"/>
     <w:rPr>
-      <w:rFonts w:asciiTheme="majorHAnsi" w:eastAsiaTheme="majorEastAsia" w:hAnsiTheme="majorHAnsi" w:cstheme="majorBidi"/>
+      <w:rFonts/>
       <w:color w:val="4F81BD" w:themeColor="accent1"/>
       <w:sz w:val="20"/>
       <w:szCs w:val="20"/>
@@ -1537,7 +1811,7 @@
     <w:semiHidden/>
     <w:rsid w:val="00FC693F"/>
     <w:rPr>
-      <w:rFonts w:asciiTheme="majorHAnsi" w:eastAsiaTheme="majorEastAsia" w:hAnsiTheme="majorHAnsi" w:cstheme="majorBidi"/>
+      <w:rFonts/>
       <w:i/>
       <w:iCs/>
       <w:color w:val="404040" w:themeColor="text1" w:themeTint="BF"/>
@@ -3123,7 +3397,7 @@
         <w:spacing w:before="0" w:after="0" w:line="240" w:lineRule="auto"/>
       </w:pPr>
       <w:rPr>
-        <w:rFonts w:asciiTheme="majorHAnsi" w:eastAsiaTheme="majorEastAsia" w:hAnsiTheme="majorHAnsi" w:cstheme="majorBidi"/>
+        <w:rFonts/>
         <w:b/>
         <w:bCs/>
       </w:rPr>
@@ -3144,7 +3418,7 @@
         <w:spacing w:before="0" w:after="0" w:line="240" w:lineRule="auto"/>
       </w:pPr>
       <w:rPr>
-        <w:rFonts w:asciiTheme="majorHAnsi" w:eastAsiaTheme="majorEastAsia" w:hAnsiTheme="majorHAnsi" w:cstheme="majorBidi"/>
+        <w:rFonts/>
         <w:b/>
         <w:bCs/>
       </w:rPr>
@@ -3162,14 +3436,14 @@
     </w:tblStylePr>
     <w:tblStylePr w:type="firstCol">
       <w:rPr>
-        <w:rFonts w:asciiTheme="majorHAnsi" w:eastAsiaTheme="majorEastAsia" w:hAnsiTheme="majorHAnsi" w:cstheme="majorBidi"/>
+        <w:rFonts/>
         <w:b/>
         <w:bCs/>
       </w:rPr>
     </w:tblStylePr>
     <w:tblStylePr w:type="lastCol">
       <w:rPr>
-        <w:rFonts w:asciiTheme="majorHAnsi" w:eastAsiaTheme="majorEastAsia" w:hAnsiTheme="majorHAnsi" w:cstheme="majorBidi"/>
+        <w:rFonts/>
         <w:b/>
         <w:bCs/>
       </w:rPr>
@@ -3253,7 +3527,7 @@
         <w:spacing w:before="0" w:after="0" w:line="240" w:lineRule="auto"/>
       </w:pPr>
       <w:rPr>
-        <w:rFonts w:asciiTheme="majorHAnsi" w:eastAsiaTheme="majorEastAsia" w:hAnsiTheme="majorHAnsi" w:cstheme="majorBidi"/>
+        <w:rFonts/>
         <w:b/>
         <w:bCs/>
       </w:rPr>
@@ -3274,7 +3548,7 @@
         <w:spacing w:before="0" w:after="0" w:line="240" w:lineRule="auto"/>
       </w:pPr>
       <w:rPr>
-        <w:rFonts w:asciiTheme="majorHAnsi" w:eastAsiaTheme="majorEastAsia" w:hAnsiTheme="majorHAnsi" w:cstheme="majorBidi"/>
+        <w:rFonts/>
         <w:b/>
         <w:bCs/>
       </w:rPr>
@@ -3292,14 +3566,14 @@
     </w:tblStylePr>
     <w:tblStylePr w:type="firstCol">
       <w:rPr>
-        <w:rFonts w:asciiTheme="majorHAnsi" w:eastAsiaTheme="majorEastAsia" w:hAnsiTheme="majorHAnsi" w:cstheme="majorBidi"/>
+        <w:rFonts/>
         <w:b/>
         <w:bCs/>
       </w:rPr>
     </w:tblStylePr>
     <w:tblStylePr w:type="lastCol">
       <w:rPr>
-        <w:rFonts w:asciiTheme="majorHAnsi" w:eastAsiaTheme="majorEastAsia" w:hAnsiTheme="majorHAnsi" w:cstheme="majorBidi"/>
+        <w:rFonts/>
         <w:b/>
         <w:bCs/>
       </w:rPr>
@@ -3383,7 +3657,7 @@
         <w:spacing w:before="0" w:after="0" w:line="240" w:lineRule="auto"/>
       </w:pPr>
       <w:rPr>
-        <w:rFonts w:asciiTheme="majorHAnsi" w:eastAsiaTheme="majorEastAsia" w:hAnsiTheme="majorHAnsi" w:cstheme="majorBidi"/>
+        <w:rFonts/>
         <w:b/>
         <w:bCs/>
       </w:rPr>
@@ -3404,7 +3678,7 @@
         <w:spacing w:before="0" w:after="0" w:line="240" w:lineRule="auto"/>
       </w:pPr>
       <w:rPr>
-        <w:rFonts w:asciiTheme="majorHAnsi" w:eastAsiaTheme="majorEastAsia" w:hAnsiTheme="majorHAnsi" w:cstheme="majorBidi"/>
+        <w:rFonts/>
         <w:b/>
         <w:bCs/>
       </w:rPr>
@@ -3422,14 +3696,14 @@
     </w:tblStylePr>
     <w:tblStylePr w:type="firstCol">
       <w:rPr>
-        <w:rFonts w:asciiTheme="majorHAnsi" w:eastAsiaTheme="majorEastAsia" w:hAnsiTheme="majorHAnsi" w:cstheme="majorBidi"/>
+        <w:rFonts/>
         <w:b/>
         <w:bCs/>
       </w:rPr>
     </w:tblStylePr>
     <w:tblStylePr w:type="lastCol">
       <w:rPr>
-        <w:rFonts w:asciiTheme="majorHAnsi" w:eastAsiaTheme="majorEastAsia" w:hAnsiTheme="majorHAnsi" w:cstheme="majorBidi"/>
+        <w:rFonts/>
         <w:b/>
         <w:bCs/>
       </w:rPr>
@@ -3513,7 +3787,7 @@
         <w:spacing w:before="0" w:after="0" w:line="240" w:lineRule="auto"/>
       </w:pPr>
       <w:rPr>
-        <w:rFonts w:asciiTheme="majorHAnsi" w:eastAsiaTheme="majorEastAsia" w:hAnsiTheme="majorHAnsi" w:cstheme="majorBidi"/>
+        <w:rFonts/>
         <w:b/>
         <w:bCs/>
       </w:rPr>
@@ -3534,7 +3808,7 @@
         <w:spacing w:before="0" w:after="0" w:line="240" w:lineRule="auto"/>
       </w:pPr>
       <w:rPr>
-        <w:rFonts w:asciiTheme="majorHAnsi" w:eastAsiaTheme="majorEastAsia" w:hAnsiTheme="majorHAnsi" w:cstheme="majorBidi"/>
+        <w:rFonts/>
         <w:b/>
         <w:bCs/>
       </w:rPr>
@@ -3552,14 +3826,14 @@
     </w:tblStylePr>
     <w:tblStylePr w:type="firstCol">
       <w:rPr>
-        <w:rFonts w:asciiTheme="majorHAnsi" w:eastAsiaTheme="majorEastAsia" w:hAnsiTheme="majorHAnsi" w:cstheme="majorBidi"/>
+        <w:rFonts/>
         <w:b/>
         <w:bCs/>
       </w:rPr>
     </w:tblStylePr>
     <w:tblStylePr w:type="lastCol">
       <w:rPr>
-        <w:rFonts w:asciiTheme="majorHAnsi" w:eastAsiaTheme="majorEastAsia" w:hAnsiTheme="majorHAnsi" w:cstheme="majorBidi"/>
+        <w:rFonts/>
         <w:b/>
         <w:bCs/>
       </w:rPr>
@@ -3643,7 +3917,7 @@
         <w:spacing w:before="0" w:after="0" w:line="240" w:lineRule="auto"/>
       </w:pPr>
       <w:rPr>
-        <w:rFonts w:asciiTheme="majorHAnsi" w:eastAsiaTheme="majorEastAsia" w:hAnsiTheme="majorHAnsi" w:cstheme="majorBidi"/>
+        <w:rFonts/>
         <w:b/>
         <w:bCs/>
       </w:rPr>
@@ -3664,7 +3938,7 @@
         <w:spacing w:before="0" w:after="0" w:line="240" w:lineRule="auto"/>
       </w:pPr>
       <w:rPr>
-        <w:rFonts w:asciiTheme="majorHAnsi" w:eastAsiaTheme="majorEastAsia" w:hAnsiTheme="majorHAnsi" w:cstheme="majorBidi"/>
+        <w:rFonts/>
         <w:b/>
         <w:bCs/>
       </w:rPr>
@@ -3682,14 +3956,14 @@
     </w:tblStylePr>
     <w:tblStylePr w:type="firstCol">
       <w:rPr>
-        <w:rFonts w:asciiTheme="majorHAnsi" w:eastAsiaTheme="majorEastAsia" w:hAnsiTheme="majorHAnsi" w:cstheme="majorBidi"/>
+        <w:rFonts/>
         <w:b/>
         <w:bCs/>
       </w:rPr>
     </w:tblStylePr>
     <w:tblStylePr w:type="lastCol">
       <w:rPr>
-        <w:rFonts w:asciiTheme="majorHAnsi" w:eastAsiaTheme="majorEastAsia" w:hAnsiTheme="majorHAnsi" w:cstheme="majorBidi"/>
+        <w:rFonts/>
         <w:b/>
         <w:bCs/>
       </w:rPr>
@@ -3773,7 +4047,7 @@
         <w:spacing w:before="0" w:after="0" w:line="240" w:lineRule="auto"/>
       </w:pPr>
       <w:rPr>
-        <w:rFonts w:asciiTheme="majorHAnsi" w:eastAsiaTheme="majorEastAsia" w:hAnsiTheme="majorHAnsi" w:cstheme="majorBidi"/>
+        <w:rFonts/>
         <w:b/>
         <w:bCs/>
       </w:rPr>
@@ -3794,7 +4068,7 @@
         <w:spacing w:before="0" w:after="0" w:line="240" w:lineRule="auto"/>
       </w:pPr>
       <w:rPr>
-        <w:rFonts w:asciiTheme="majorHAnsi" w:eastAsiaTheme="majorEastAsia" w:hAnsiTheme="majorHAnsi" w:cstheme="majorBidi"/>
+        <w:rFonts/>
         <w:b/>
         <w:bCs/>
       </w:rPr>
@@ -3812,14 +4086,14 @@
     </w:tblStylePr>
     <w:tblStylePr w:type="firstCol">
       <w:rPr>
-        <w:rFonts w:asciiTheme="majorHAnsi" w:eastAsiaTheme="majorEastAsia" w:hAnsiTheme="majorHAnsi" w:cstheme="majorBidi"/>
+        <w:rFonts/>
         <w:b/>
         <w:bCs/>
       </w:rPr>
     </w:tblStylePr>
     <w:tblStylePr w:type="lastCol">
       <w:rPr>
-        <w:rFonts w:asciiTheme="majorHAnsi" w:eastAsiaTheme="majorEastAsia" w:hAnsiTheme="majorHAnsi" w:cstheme="majorBidi"/>
+        <w:rFonts/>
         <w:b/>
         <w:bCs/>
       </w:rPr>
@@ -3903,7 +4177,7 @@
         <w:spacing w:before="0" w:after="0" w:line="240" w:lineRule="auto"/>
       </w:pPr>
       <w:rPr>
-        <w:rFonts w:asciiTheme="majorHAnsi" w:eastAsiaTheme="majorEastAsia" w:hAnsiTheme="majorHAnsi" w:cstheme="majorBidi"/>
+        <w:rFonts/>
         <w:b/>
         <w:bCs/>
       </w:rPr>
@@ -3924,7 +4198,7 @@
         <w:spacing w:before="0" w:after="0" w:line="240" w:lineRule="auto"/>
       </w:pPr>
       <w:rPr>
-        <w:rFonts w:asciiTheme="majorHAnsi" w:eastAsiaTheme="majorEastAsia" w:hAnsiTheme="majorHAnsi" w:cstheme="majorBidi"/>
+        <w:rFonts/>
         <w:b/>
         <w:bCs/>
       </w:rPr>
@@ -3942,14 +4216,14 @@
     </w:tblStylePr>
     <w:tblStylePr w:type="firstCol">
       <w:rPr>
-        <w:rFonts w:asciiTheme="majorHAnsi" w:eastAsiaTheme="majorEastAsia" w:hAnsiTheme="majorHAnsi" w:cstheme="majorBidi"/>
+        <w:rFonts/>
         <w:b/>
         <w:bCs/>
       </w:rPr>
     </w:tblStylePr>
     <w:tblStylePr w:type="lastCol">
       <w:rPr>
-        <w:rFonts w:asciiTheme="majorHAnsi" w:eastAsiaTheme="majorEastAsia" w:hAnsiTheme="majorHAnsi" w:cstheme="majorBidi"/>
+        <w:rFonts/>
         <w:b/>
         <w:bCs/>
       </w:rPr>
@@ -5814,7 +6088,7 @@
     </w:tblPr>
     <w:tblStylePr w:type="firstRow">
       <w:rPr>
-        <w:rFonts w:asciiTheme="majorHAnsi" w:eastAsiaTheme="majorEastAsia" w:hAnsiTheme="majorHAnsi" w:cstheme="majorBidi"/>
+        <w:rFonts/>
       </w:rPr>
       <w:tblPr/>
       <w:tcPr>
@@ -5898,7 +6172,7 @@
     </w:tblPr>
     <w:tblStylePr w:type="firstRow">
       <w:rPr>
-        <w:rFonts w:asciiTheme="majorHAnsi" w:eastAsiaTheme="majorEastAsia" w:hAnsiTheme="majorHAnsi" w:cstheme="majorBidi"/>
+        <w:rFonts/>
       </w:rPr>
       <w:tblPr/>
       <w:tcPr>
@@ -5982,7 +6256,7 @@
     </w:tblPr>
     <w:tblStylePr w:type="firstRow">
       <w:rPr>
-        <w:rFonts w:asciiTheme="majorHAnsi" w:eastAsiaTheme="majorEastAsia" w:hAnsiTheme="majorHAnsi" w:cstheme="majorBidi"/>
+        <w:rFonts/>
       </w:rPr>
       <w:tblPr/>
       <w:tcPr>
@@ -6066,7 +6340,7 @@
     </w:tblPr>
     <w:tblStylePr w:type="firstRow">
       <w:rPr>
-        <w:rFonts w:asciiTheme="majorHAnsi" w:eastAsiaTheme="majorEastAsia" w:hAnsiTheme="majorHAnsi" w:cstheme="majorBidi"/>
+        <w:rFonts/>
       </w:rPr>
       <w:tblPr/>
       <w:tcPr>
@@ -6150,7 +6424,7 @@
     </w:tblPr>
     <w:tblStylePr w:type="firstRow">
       <w:rPr>
-        <w:rFonts w:asciiTheme="majorHAnsi" w:eastAsiaTheme="majorEastAsia" w:hAnsiTheme="majorHAnsi" w:cstheme="majorBidi"/>
+        <w:rFonts/>
       </w:rPr>
       <w:tblPr/>
       <w:tcPr>
@@ -6234,7 +6508,7 @@
     </w:tblPr>
     <w:tblStylePr w:type="firstRow">
       <w:rPr>
-        <w:rFonts w:asciiTheme="majorHAnsi" w:eastAsiaTheme="majorEastAsia" w:hAnsiTheme="majorHAnsi" w:cstheme="majorBidi"/>
+        <w:rFonts/>
       </w:rPr>
       <w:tblPr/>
       <w:tcPr>
@@ -6318,7 +6592,7 @@
     </w:tblPr>
     <w:tblStylePr w:type="firstRow">
       <w:rPr>
-        <w:rFonts w:asciiTheme="majorHAnsi" w:eastAsiaTheme="majorEastAsia" w:hAnsiTheme="majorHAnsi" w:cstheme="majorBidi"/>
+        <w:rFonts/>
       </w:rPr>
       <w:tblPr/>
       <w:tcPr>
@@ -6383,7 +6657,7 @@
       <w:spacing w:after="0" w:line="240" w:lineRule="auto"/>
     </w:pPr>
     <w:rPr>
-      <w:rFonts w:asciiTheme="majorHAnsi" w:eastAsiaTheme="majorEastAsia" w:hAnsiTheme="majorHAnsi" w:cstheme="majorBidi"/>
+      <w:rFonts/>
       <w:color w:val="000000" w:themeColor="text1"/>
     </w:rPr>
     <w:tblPr>
@@ -6511,7 +6785,7 @@
       <w:spacing w:after="0" w:line="240" w:lineRule="auto"/>
     </w:pPr>
     <w:rPr>
-      <w:rFonts w:asciiTheme="majorHAnsi" w:eastAsiaTheme="majorEastAsia" w:hAnsiTheme="majorHAnsi" w:cstheme="majorBidi"/>
+      <w:rFonts/>
       <w:color w:val="000000" w:themeColor="text1"/>
     </w:rPr>
     <w:tblPr>
@@ -6639,7 +6913,7 @@
       <w:spacing w:after="0" w:line="240" w:lineRule="auto"/>
     </w:pPr>
     <w:rPr>
-      <w:rFonts w:asciiTheme="majorHAnsi" w:eastAsiaTheme="majorEastAsia" w:hAnsiTheme="majorHAnsi" w:cstheme="majorBidi"/>
+      <w:rFonts/>
       <w:color w:val="000000" w:themeColor="text1"/>
     </w:rPr>
     <w:tblPr>
@@ -6767,7 +7041,7 @@
       <w:spacing w:after="0" w:line="240" w:lineRule="auto"/>
     </w:pPr>
     <w:rPr>
-      <w:rFonts w:asciiTheme="majorHAnsi" w:eastAsiaTheme="majorEastAsia" w:hAnsiTheme="majorHAnsi" w:cstheme="majorBidi"/>
+      <w:rFonts/>
       <w:color w:val="000000" w:themeColor="text1"/>
     </w:rPr>
     <w:tblPr>
@@ -6895,7 +7169,7 @@
       <w:spacing w:after="0" w:line="240" w:lineRule="auto"/>
     </w:pPr>
     <w:rPr>
-      <w:rFonts w:asciiTheme="majorHAnsi" w:eastAsiaTheme="majorEastAsia" w:hAnsiTheme="majorHAnsi" w:cstheme="majorBidi"/>
+      <w:rFonts/>
       <w:color w:val="000000" w:themeColor="text1"/>
     </w:rPr>
     <w:tblPr>
@@ -7023,7 +7297,7 @@
       <w:spacing w:after="0" w:line="240" w:lineRule="auto"/>
     </w:pPr>
     <w:rPr>
-      <w:rFonts w:asciiTheme="majorHAnsi" w:eastAsiaTheme="majorEastAsia" w:hAnsiTheme="majorHAnsi" w:cstheme="majorBidi"/>
+      <w:rFonts/>
       <w:color w:val="000000" w:themeColor="text1"/>
     </w:rPr>
     <w:tblPr>
@@ -7151,7 +7425,7 @@
       <w:spacing w:after="0" w:line="240" w:lineRule="auto"/>
     </w:pPr>
     <w:rPr>
-      <w:rFonts w:asciiTheme="majorHAnsi" w:eastAsiaTheme="majorEastAsia" w:hAnsiTheme="majorHAnsi" w:cstheme="majorBidi"/>
+      <w:rFonts/>
       <w:color w:val="000000" w:themeColor="text1"/>
     </w:rPr>
     <w:tblPr>
@@ -7790,7 +8064,7 @@
       <w:spacing w:after="0" w:line="240" w:lineRule="auto"/>
     </w:pPr>
     <w:rPr>
-      <w:rFonts w:asciiTheme="majorHAnsi" w:eastAsiaTheme="majorEastAsia" w:hAnsiTheme="majorHAnsi" w:cstheme="majorBidi"/>
+      <w:rFonts/>
       <w:color w:val="000000" w:themeColor="text1"/>
     </w:rPr>
     <w:tblPr>
@@ -7915,7 +8189,7 @@
       <w:spacing w:after="0" w:line="240" w:lineRule="auto"/>
     </w:pPr>
     <w:rPr>
-      <w:rFonts w:asciiTheme="majorHAnsi" w:eastAsiaTheme="majorEastAsia" w:hAnsiTheme="majorHAnsi" w:cstheme="majorBidi"/>
+      <w:rFonts/>
       <w:color w:val="000000" w:themeColor="text1"/>
     </w:rPr>
     <w:tblPr>
@@ -8040,7 +8314,7 @@
       <w:spacing w:after="0" w:line="240" w:lineRule="auto"/>
     </w:pPr>
     <w:rPr>
-      <w:rFonts w:asciiTheme="majorHAnsi" w:eastAsiaTheme="majorEastAsia" w:hAnsiTheme="majorHAnsi" w:cstheme="majorBidi"/>
+      <w:rFonts/>
       <w:color w:val="000000" w:themeColor="text1"/>
     </w:rPr>
     <w:tblPr>
@@ -8165,7 +8439,7 @@
       <w:spacing w:after="0" w:line="240" w:lineRule="auto"/>
     </w:pPr>
     <w:rPr>
-      <w:rFonts w:asciiTheme="majorHAnsi" w:eastAsiaTheme="majorEastAsia" w:hAnsiTheme="majorHAnsi" w:cstheme="majorBidi"/>
+      <w:rFonts/>
       <w:color w:val="000000" w:themeColor="text1"/>
     </w:rPr>
     <w:tblPr>
@@ -8290,7 +8564,7 @@
       <w:spacing w:after="0" w:line="240" w:lineRule="auto"/>
     </w:pPr>
     <w:rPr>
-      <w:rFonts w:asciiTheme="majorHAnsi" w:eastAsiaTheme="majorEastAsia" w:hAnsiTheme="majorHAnsi" w:cstheme="majorBidi"/>
+      <w:rFonts/>
       <w:color w:val="000000" w:themeColor="text1"/>
     </w:rPr>
     <w:tblPr>
@@ -8415,7 +8689,7 @@
       <w:spacing w:after="0" w:line="240" w:lineRule="auto"/>
     </w:pPr>
     <w:rPr>
-      <w:rFonts w:asciiTheme="majorHAnsi" w:eastAsiaTheme="majorEastAsia" w:hAnsiTheme="majorHAnsi" w:cstheme="majorBidi"/>
+      <w:rFonts/>
       <w:color w:val="000000" w:themeColor="text1"/>
     </w:rPr>
     <w:tblPr>
@@ -8540,7 +8814,7 @@
       <w:spacing w:after="0" w:line="240" w:lineRule="auto"/>
     </w:pPr>
     <w:rPr>
-      <w:rFonts w:asciiTheme="majorHAnsi" w:eastAsiaTheme="majorEastAsia" w:hAnsiTheme="majorHAnsi" w:cstheme="majorBidi"/>
+      <w:rFonts/>
       <w:color w:val="000000" w:themeColor="text1"/>
     </w:rPr>
     <w:tblPr>

</xml_diff>